<commit_message>
fix: metrics explainer cover page logo rendering and author name
</commit_message>
<xml_diff>
--- a/docs/_research-tools/generators/metrics_explainer.docx
+++ b/docs/_research-tools/generators/metrics_explainer.docx
@@ -82,6 +82,20 @@
           <w:sz w:val="40"/>
         </w:rPr>
         <w:t>The Orchard</w:t>
+      </w:r>
+    </w:p>
+    <w:p/>
+    <w:p>
+      <w:pPr>
+        <w:jc w:val="center"/>
+      </w:pPr>
+      <w:r>
+        <w:rPr>
+          <w:rFonts w:ascii="Calibri" w:hAnsi="Calibri"/>
+          <w:color w:val="333333"/>
+          <w:sz w:val="28"/>
+        </w:rPr>
+        <w:t>Yoad Oxman</w:t>
       </w:r>
     </w:p>
     <w:p/>

</xml_diff>